<commit_message>
Cập nhật báo cáo đồ án theo hệ thống đã cài đặt
Tệp mẫu Mau_do_an_IE402.docx đã có lại nên sinh lại được DO-AN-IE402-*.docx:

- Chương 3: thêm "Hệ thống đã cài đặt" — kiến trúc, lý do đặt logic không gian
  trong CSDL, bảng 11 điểm cuối API và hai ảnh giao diện thật
- Chương 4: thêm "Kiểm chứng cơ sở dữ liệu và toàn hệ thống" với bảng 7 kịch bản
  chạy đầu cuối (R1-R4, chặn phân quyền 403, luồng duyệt đơn giải trình)
- Trang bìa: điền tên nhóm và bảng 4 thành viên
- Sửa mục "Kết quả đạt được" cho khớp thực tế: thuật toán nằm ở PostGIS và được
  cả máy chủ lẫn bản dựng thử dùng chung

Báo cáo: 23 heading, 18 bảng, 12 hình.
</commit_message>
<xml_diff>
--- a/ie402-chamcong-3d/DO-AN-IE402-Cham-cong-dinh-vi-3D.docx
+++ b/ie402-chamcong-3d/DO-AN-IE402-Cham-cong-dinh-vi-3D.docx
@@ -308,7 +308,7 @@
           <w:szCs w:val="28"/>
           <w:rtl w:val="0"/>
         </w:rPr>
-        <w:t xml:space="preserve">Tên nhóm:</w:t>
+        <w:t>Tên nhóm: Nhóm 1</w:t>
       </w:r>
       <w:r>
         <w:rPr>
@@ -317,7 +317,6 @@
           <w:szCs w:val="28"/>
           <w:rtl w:val="0"/>
         </w:rPr>
-        <w:t xml:space="preserve"> …………………………………………………….</w:t>
       </w:r>
     </w:p>
     <w:p>
@@ -461,60 +460,24 @@
         <w:tc>
           <w:tcPr/>
           <w:p>
-            <w:pPr>
-              <w:pageBreakBefore w:val="0"/>
-              <w:jc w:val="both"/>
-              <w:rPr>
-                <w:rFonts w:ascii="Times New Roman" w:cs="Times New Roman" w:eastAsia="Times New Roman" w:hAnsi="Times New Roman"/>
-                <w:b w:val="1"/>
-                <w:sz w:val="26"/>
-                <w:szCs w:val="26"/>
-              </w:rPr>
-            </w:pPr>
-            <w:r>
-              <w:rPr>
-                <w:rtl w:val="0"/>
-              </w:rPr>
+            <w:r>
+              <w:t>1</w:t>
             </w:r>
           </w:p>
         </w:tc>
         <w:tc>
           <w:tcPr/>
           <w:p>
-            <w:pPr>
-              <w:pageBreakBefore w:val="0"/>
-              <w:jc w:val="right"/>
-              <w:rPr>
-                <w:rFonts w:ascii="Times New Roman" w:cs="Times New Roman" w:eastAsia="Times New Roman" w:hAnsi="Times New Roman"/>
-                <w:b w:val="1"/>
-                <w:sz w:val="26"/>
-                <w:szCs w:val="26"/>
-              </w:rPr>
-            </w:pPr>
-            <w:r>
-              <w:rPr>
-                <w:rtl w:val="0"/>
-              </w:rPr>
+            <w:r>
+              <w:t>23730217</w:t>
             </w:r>
           </w:p>
         </w:tc>
         <w:tc>
           <w:tcPr/>
           <w:p>
-            <w:pPr>
-              <w:pageBreakBefore w:val="0"/>
-              <w:jc w:val="both"/>
-              <w:rPr>
-                <w:rFonts w:ascii="Times New Roman" w:cs="Times New Roman" w:eastAsia="Times New Roman" w:hAnsi="Times New Roman"/>
-                <w:b w:val="1"/>
-                <w:sz w:val="26"/>
-                <w:szCs w:val="26"/>
-              </w:rPr>
-            </w:pPr>
-            <w:r>
-              <w:rPr>
-                <w:rtl w:val="0"/>
-              </w:rPr>
+            <w:r>
+              <w:t>Nguyễn Hữu Tín</w:t>
             </w:r>
           </w:p>
         </w:tc>
@@ -527,60 +490,24 @@
         <w:tc>
           <w:tcPr/>
           <w:p>
-            <w:pPr>
-              <w:pageBreakBefore w:val="0"/>
-              <w:jc w:val="both"/>
-              <w:rPr>
-                <w:rFonts w:ascii="Times New Roman" w:cs="Times New Roman" w:eastAsia="Times New Roman" w:hAnsi="Times New Roman"/>
-                <w:b w:val="1"/>
-                <w:sz w:val="26"/>
-                <w:szCs w:val="26"/>
-              </w:rPr>
-            </w:pPr>
-            <w:r>
-              <w:rPr>
-                <w:rtl w:val="0"/>
-              </w:rPr>
+            <w:r>
+              <w:t>2</w:t>
             </w:r>
           </w:p>
         </w:tc>
         <w:tc>
           <w:tcPr/>
           <w:p>
-            <w:pPr>
-              <w:pageBreakBefore w:val="0"/>
-              <w:jc w:val="right"/>
-              <w:rPr>
-                <w:rFonts w:ascii="Times New Roman" w:cs="Times New Roman" w:eastAsia="Times New Roman" w:hAnsi="Times New Roman"/>
-                <w:b w:val="1"/>
-                <w:sz w:val="26"/>
-                <w:szCs w:val="26"/>
-              </w:rPr>
-            </w:pPr>
-            <w:r>
-              <w:rPr>
-                <w:rtl w:val="0"/>
-              </w:rPr>
+            <w:r>
+              <w:t>23730177</w:t>
             </w:r>
           </w:p>
         </w:tc>
         <w:tc>
           <w:tcPr/>
           <w:p>
-            <w:pPr>
-              <w:pageBreakBefore w:val="0"/>
-              <w:jc w:val="both"/>
-              <w:rPr>
-                <w:rFonts w:ascii="Times New Roman" w:cs="Times New Roman" w:eastAsia="Times New Roman" w:hAnsi="Times New Roman"/>
-                <w:b w:val="1"/>
-                <w:sz w:val="26"/>
-                <w:szCs w:val="26"/>
-              </w:rPr>
-            </w:pPr>
-            <w:r>
-              <w:rPr>
-                <w:rtl w:val="0"/>
-              </w:rPr>
+            <w:r>
+              <w:t>Nguyễn Minh Khôi</w:t>
             </w:r>
           </w:p>
         </w:tc>
@@ -593,60 +520,24 @@
         <w:tc>
           <w:tcPr/>
           <w:p>
-            <w:pPr>
-              <w:pageBreakBefore w:val="0"/>
-              <w:jc w:val="both"/>
-              <w:rPr>
-                <w:rFonts w:ascii="Times New Roman" w:cs="Times New Roman" w:eastAsia="Times New Roman" w:hAnsi="Times New Roman"/>
-                <w:b w:val="1"/>
-                <w:sz w:val="26"/>
-                <w:szCs w:val="26"/>
-              </w:rPr>
-            </w:pPr>
-            <w:r>
-              <w:rPr>
-                <w:rtl w:val="0"/>
-              </w:rPr>
+            <w:r>
+              <w:t>3</w:t>
             </w:r>
           </w:p>
         </w:tc>
         <w:tc>
           <w:tcPr/>
           <w:p>
-            <w:pPr>
-              <w:pageBreakBefore w:val="0"/>
-              <w:jc w:val="right"/>
-              <w:rPr>
-                <w:rFonts w:ascii="Times New Roman" w:cs="Times New Roman" w:eastAsia="Times New Roman" w:hAnsi="Times New Roman"/>
-                <w:b w:val="1"/>
-                <w:sz w:val="26"/>
-                <w:szCs w:val="26"/>
-              </w:rPr>
-            </w:pPr>
-            <w:r>
-              <w:rPr>
-                <w:rtl w:val="0"/>
-              </w:rPr>
+            <w:r>
+              <w:t>23730226</w:t>
             </w:r>
           </w:p>
         </w:tc>
         <w:tc>
           <w:tcPr/>
           <w:p>
-            <w:pPr>
-              <w:pageBreakBefore w:val="0"/>
-              <w:jc w:val="both"/>
-              <w:rPr>
-                <w:rFonts w:ascii="Times New Roman" w:cs="Times New Roman" w:eastAsia="Times New Roman" w:hAnsi="Times New Roman"/>
-                <w:b w:val="1"/>
-                <w:sz w:val="26"/>
-                <w:szCs w:val="26"/>
-              </w:rPr>
-            </w:pPr>
-            <w:r>
-              <w:rPr>
-                <w:rtl w:val="0"/>
-              </w:rPr>
+            <w:r>
+              <w:t>Nguyễn Tường Vy</w:t>
             </w:r>
           </w:p>
         </w:tc>
@@ -659,60 +550,24 @@
         <w:tc>
           <w:tcPr/>
           <w:p>
-            <w:pPr>
-              <w:pageBreakBefore w:val="0"/>
-              <w:jc w:val="both"/>
-              <w:rPr>
-                <w:rFonts w:ascii="Times New Roman" w:cs="Times New Roman" w:eastAsia="Times New Roman" w:hAnsi="Times New Roman"/>
-                <w:b w:val="1"/>
-                <w:sz w:val="26"/>
-                <w:szCs w:val="26"/>
-              </w:rPr>
-            </w:pPr>
-            <w:r>
-              <w:rPr>
-                <w:rtl w:val="0"/>
-              </w:rPr>
+            <w:r>
+              <w:t>4</w:t>
             </w:r>
           </w:p>
         </w:tc>
         <w:tc>
           <w:tcPr/>
           <w:p>
-            <w:pPr>
-              <w:pageBreakBefore w:val="0"/>
-              <w:jc w:val="right"/>
-              <w:rPr>
-                <w:rFonts w:ascii="Times New Roman" w:cs="Times New Roman" w:eastAsia="Times New Roman" w:hAnsi="Times New Roman"/>
-                <w:b w:val="1"/>
-                <w:sz w:val="26"/>
-                <w:szCs w:val="26"/>
-              </w:rPr>
-            </w:pPr>
-            <w:r>
-              <w:rPr>
-                <w:rtl w:val="0"/>
-              </w:rPr>
+            <w:r>
+              <w:t>23730204</w:t>
             </w:r>
           </w:p>
         </w:tc>
         <w:tc>
           <w:tcPr/>
           <w:p>
-            <w:pPr>
-              <w:pageBreakBefore w:val="0"/>
-              <w:jc w:val="both"/>
-              <w:rPr>
-                <w:rFonts w:ascii="Times New Roman" w:cs="Times New Roman" w:eastAsia="Times New Roman" w:hAnsi="Times New Roman"/>
-                <w:b w:val="1"/>
-                <w:sz w:val="26"/>
-                <w:szCs w:val="26"/>
-              </w:rPr>
-            </w:pPr>
-            <w:r>
-              <w:rPr>
-                <w:rtl w:val="0"/>
-              </w:rPr>
+            <w:r>
+              <w:t>Võ Thành Nhân</w:t>
             </w:r>
           </w:p>
         </w:tc>
@@ -8422,6 +8277,880 @@
       </w:r>
     </w:p>
     <w:p>
+      <w:r>
+        <w:rPr>
+          <w:b w:val="0"/>
+          <w:i w:val="0"/>
+        </w:rPr>
+      </w:r>
+    </w:p>
+    <w:p>
+      <w:r>
+        <w:rPr>
+          <w:b/>
+          <w:i w:val="0"/>
+        </w:rPr>
+        <w:t>Hệ thống đã cài đặt</w:t>
+      </w:r>
+    </w:p>
+    <w:p>
+      <w:r>
+        <w:rPr>
+          <w:b w:val="0"/>
+          <w:i w:val="0"/>
+        </w:rPr>
+        <w:t>Toàn bộ danh sách màn hình trên đã được cài đặt thành ứng dụng chạy được, không dừng ở mức mô tả. Máy chủ Node.js với Express nói chuyện trực tiếp với PostgreSQL/PostGIS và phục vụ luôn giao diện web tĩnh, nên hệ thống chạy trên một cổng duy nhất — điều này quan trọng vì Geolocation API chỉ cấp quyền định vị trên HTTPS hoặc localhost.</w:t>
+      </w:r>
+    </w:p>
+    <w:p>
+      <w:r>
+        <w:rPr>
+          <w:b w:val="0"/>
+          <w:i w:val="0"/>
+        </w:rPr>
+        <w:t>Về mặt kiến trúc, phép kiểm tra bao hàm khối không được viết lại ở tầng ứng dụng mà gọi thẳng hàm kiem_tra_bao_ham() và kiem_tra_r2() đã cài đặt trong cơ sở dữ liệu. Nhờ vậy logic không gian chỉ tồn tại một bản duy nhất, đặt ngay cạnh dữ liệu. Mỗi lần chấm công được xử lý trong một giao dịch: ghi bản ghi, áp bốn quy tắc R1–R4 rồi ghi cảnh báo; lỗi ở bất kỳ bước nào thì huỷ toàn bộ.</w:t>
+      </w:r>
+    </w:p>
+    <w:tbl>
+      <w:tblPr>
+        <w:tblStyle w:val="TableGrid"/>
+        <w:tblW w:type="auto" w:w="0"/>
+        <w:tblLook w:firstColumn="1" w:firstRow="1" w:lastColumn="0" w:lastRow="0" w:noHBand="0" w:noVBand="1" w:val="04A0"/>
+      </w:tblPr>
+      <w:tblGrid>
+        <w:gridCol w:w="2340"/>
+        <w:gridCol w:w="2340"/>
+        <w:gridCol w:w="2340"/>
+        <w:gridCol w:w="2340"/>
+      </w:tblGrid>
+      <w:tr>
+        <w:tc>
+          <w:tcPr>
+            <w:tcW w:type="dxa" w:w="1224"/>
+          </w:tcPr>
+          <w:p>
+            <w:r/>
+            <w:r>
+              <w:rPr>
+                <w:b/>
+                <w:sz w:val="20"/>
+              </w:rPr>
+              <w:t>Phương thức</w:t>
+            </w:r>
+          </w:p>
+        </w:tc>
+        <w:tc>
+          <w:tcPr>
+            <w:tcW w:type="dxa" w:w="2304"/>
+          </w:tcPr>
+          <w:p>
+            <w:r/>
+            <w:r>
+              <w:rPr>
+                <w:b/>
+                <w:sz w:val="20"/>
+              </w:rPr>
+              <w:t>Đường dẫn</w:t>
+            </w:r>
+          </w:p>
+        </w:tc>
+        <w:tc>
+          <w:tcPr>
+            <w:tcW w:type="dxa" w:w="1368"/>
+          </w:tcPr>
+          <w:p>
+            <w:r/>
+            <w:r>
+              <w:rPr>
+                <w:b/>
+                <w:sz w:val="20"/>
+              </w:rPr>
+              <w:t>Quyền</w:t>
+            </w:r>
+          </w:p>
+        </w:tc>
+        <w:tc>
+          <w:tcPr>
+            <w:tcW w:type="dxa" w:w="3888"/>
+          </w:tcPr>
+          <w:p>
+            <w:r/>
+            <w:r>
+              <w:rPr>
+                <w:b/>
+                <w:sz w:val="20"/>
+              </w:rPr>
+              <w:t>Chức năng</w:t>
+            </w:r>
+          </w:p>
+        </w:tc>
+      </w:tr>
+      <w:tr>
+        <w:tc>
+          <w:tcPr>
+            <w:tcW w:type="dxa" w:w="1224"/>
+          </w:tcPr>
+          <w:p>
+            <w:r/>
+            <w:r>
+              <w:rPr>
+                <w:sz w:val="20"/>
+              </w:rPr>
+              <w:t>POST</w:t>
+            </w:r>
+          </w:p>
+        </w:tc>
+        <w:tc>
+          <w:tcPr>
+            <w:tcW w:type="dxa" w:w="2304"/>
+          </w:tcPr>
+          <w:p>
+            <w:r/>
+            <w:r>
+              <w:rPr>
+                <w:sz w:val="20"/>
+              </w:rPr>
+              <w:t>/api/dang-nhap</w:t>
+            </w:r>
+          </w:p>
+        </w:tc>
+        <w:tc>
+          <w:tcPr>
+            <w:tcW w:type="dxa" w:w="1368"/>
+          </w:tcPr>
+          <w:p>
+            <w:r/>
+            <w:r>
+              <w:rPr>
+                <w:sz w:val="20"/>
+              </w:rPr>
+              <w:t>—</w:t>
+            </w:r>
+          </w:p>
+        </w:tc>
+        <w:tc>
+          <w:tcPr>
+            <w:tcW w:type="dxa" w:w="3888"/>
+          </w:tcPr>
+          <w:p>
+            <w:r/>
+            <w:r>
+              <w:rPr>
+                <w:sz w:val="20"/>
+              </w:rPr>
+              <w:t>Đăng nhập, trả về JWT</w:t>
+            </w:r>
+          </w:p>
+        </w:tc>
+      </w:tr>
+      <w:tr>
+        <w:tc>
+          <w:tcPr>
+            <w:tcW w:type="dxa" w:w="1224"/>
+          </w:tcPr>
+          <w:p>
+            <w:r/>
+            <w:r>
+              <w:rPr>
+                <w:sz w:val="20"/>
+              </w:rPr>
+              <w:t>GET</w:t>
+            </w:r>
+          </w:p>
+        </w:tc>
+        <w:tc>
+          <w:tcPr>
+            <w:tcW w:type="dxa" w:w="2304"/>
+          </w:tcPr>
+          <w:p>
+            <w:r/>
+            <w:r>
+              <w:rPr>
+                <w:sz w:val="20"/>
+              </w:rPr>
+              <w:t>/api/toi</w:t>
+            </w:r>
+          </w:p>
+        </w:tc>
+        <w:tc>
+          <w:tcPr>
+            <w:tcW w:type="dxa" w:w="1368"/>
+          </w:tcPr>
+          <w:p>
+            <w:r/>
+            <w:r>
+              <w:rPr>
+                <w:sz w:val="20"/>
+              </w:rPr>
+              <w:t>đã đăng nhập</w:t>
+            </w:r>
+          </w:p>
+        </w:tc>
+        <w:tc>
+          <w:tcPr>
+            <w:tcW w:type="dxa" w:w="3888"/>
+          </w:tcPr>
+          <w:p>
+            <w:r/>
+            <w:r>
+              <w:rPr>
+                <w:sz w:val="20"/>
+              </w:rPr>
+              <w:t>Thông tin nhân viên và khối MAP của họ</w:t>
+            </w:r>
+          </w:p>
+        </w:tc>
+      </w:tr>
+      <w:tr>
+        <w:tc>
+          <w:tcPr>
+            <w:tcW w:type="dxa" w:w="1224"/>
+          </w:tcPr>
+          <w:p>
+            <w:r/>
+            <w:r>
+              <w:rPr>
+                <w:sz w:val="20"/>
+              </w:rPr>
+              <w:t>GET</w:t>
+            </w:r>
+          </w:p>
+        </w:tc>
+        <w:tc>
+          <w:tcPr>
+            <w:tcW w:type="dxa" w:w="2304"/>
+          </w:tcPr>
+          <w:p>
+            <w:r/>
+            <w:r>
+              <w:rPr>
+                <w:sz w:val="20"/>
+              </w:rPr>
+              <w:t>/api/khu-vuc</w:t>
+            </w:r>
+          </w:p>
+        </w:tc>
+        <w:tc>
+          <w:tcPr>
+            <w:tcW w:type="dxa" w:w="1368"/>
+          </w:tcPr>
+          <w:p>
+            <w:r/>
+            <w:r>
+              <w:rPr>
+                <w:sz w:val="20"/>
+              </w:rPr>
+              <w:t>đã đăng nhập</w:t>
+            </w:r>
+          </w:p>
+        </w:tc>
+        <w:tc>
+          <w:tcPr>
+            <w:tcW w:type="dxa" w:w="3888"/>
+          </w:tcPr>
+          <w:p>
+            <w:r/>
+            <w:r>
+              <w:rPr>
+                <w:sz w:val="20"/>
+              </w:rPr>
+              <w:t>Danh sách khối MAP để vẽ bản đồ</w:t>
+            </w:r>
+          </w:p>
+        </w:tc>
+      </w:tr>
+      <w:tr>
+        <w:tc>
+          <w:tcPr>
+            <w:tcW w:type="dxa" w:w="1224"/>
+          </w:tcPr>
+          <w:p>
+            <w:r/>
+            <w:r>
+              <w:rPr>
+                <w:sz w:val="20"/>
+              </w:rPr>
+              <w:t>POST</w:t>
+            </w:r>
+          </w:p>
+        </w:tc>
+        <w:tc>
+          <w:tcPr>
+            <w:tcW w:type="dxa" w:w="2304"/>
+          </w:tcPr>
+          <w:p>
+            <w:r/>
+            <w:r>
+              <w:rPr>
+                <w:sz w:val="20"/>
+              </w:rPr>
+              <w:t>/api/cham-cong</w:t>
+            </w:r>
+          </w:p>
+        </w:tc>
+        <w:tc>
+          <w:tcPr>
+            <w:tcW w:type="dxa" w:w="1368"/>
+          </w:tcPr>
+          <w:p>
+            <w:r/>
+            <w:r>
+              <w:rPr>
+                <w:sz w:val="20"/>
+              </w:rPr>
+              <w:t>đã đăng nhập</w:t>
+            </w:r>
+          </w:p>
+        </w:tc>
+        <w:tc>
+          <w:tcPr>
+            <w:tcW w:type="dxa" w:w="3888"/>
+          </w:tcPr>
+          <w:p>
+            <w:r/>
+            <w:r>
+              <w:rPr>
+                <w:sz w:val="20"/>
+              </w:rPr>
+              <w:t>Kiểm tra bao hàm khối, áp R1–R4, ghi bản ghi và cảnh báo</w:t>
+            </w:r>
+          </w:p>
+        </w:tc>
+      </w:tr>
+      <w:tr>
+        <w:tc>
+          <w:tcPr>
+            <w:tcW w:type="dxa" w:w="1224"/>
+          </w:tcPr>
+          <w:p>
+            <w:r/>
+            <w:r>
+              <w:rPr>
+                <w:sz w:val="20"/>
+              </w:rPr>
+              <w:t>GET</w:t>
+            </w:r>
+          </w:p>
+        </w:tc>
+        <w:tc>
+          <w:tcPr>
+            <w:tcW w:type="dxa" w:w="2304"/>
+          </w:tcPr>
+          <w:p>
+            <w:r/>
+            <w:r>
+              <w:rPr>
+                <w:sz w:val="20"/>
+              </w:rPr>
+              <w:t>/api/cham-cong/lich-su</w:t>
+            </w:r>
+          </w:p>
+        </w:tc>
+        <w:tc>
+          <w:tcPr>
+            <w:tcW w:type="dxa" w:w="1368"/>
+          </w:tcPr>
+          <w:p>
+            <w:r/>
+            <w:r>
+              <w:rPr>
+                <w:sz w:val="20"/>
+              </w:rPr>
+              <w:t>đã đăng nhập</w:t>
+            </w:r>
+          </w:p>
+        </w:tc>
+        <w:tc>
+          <w:tcPr>
+            <w:tcW w:type="dxa" w:w="3888"/>
+          </w:tcPr>
+          <w:p>
+            <w:r/>
+            <w:r>
+              <w:rPr>
+                <w:sz w:val="20"/>
+              </w:rPr>
+              <w:t>Lịch sử của chính mình</w:t>
+            </w:r>
+          </w:p>
+        </w:tc>
+      </w:tr>
+      <w:tr>
+        <w:tc>
+          <w:tcPr>
+            <w:tcW w:type="dxa" w:w="1224"/>
+          </w:tcPr>
+          <w:p>
+            <w:r/>
+            <w:r>
+              <w:rPr>
+                <w:sz w:val="20"/>
+              </w:rPr>
+              <w:t>POST</w:t>
+            </w:r>
+          </w:p>
+        </w:tc>
+        <w:tc>
+          <w:tcPr>
+            <w:tcW w:type="dxa" w:w="2304"/>
+          </w:tcPr>
+          <w:p>
+            <w:r/>
+            <w:r>
+              <w:rPr>
+                <w:sz w:val="20"/>
+              </w:rPr>
+              <w:t>/api/giai-trinh</w:t>
+            </w:r>
+          </w:p>
+        </w:tc>
+        <w:tc>
+          <w:tcPr>
+            <w:tcW w:type="dxa" w:w="1368"/>
+          </w:tcPr>
+          <w:p>
+            <w:r/>
+            <w:r>
+              <w:rPr>
+                <w:sz w:val="20"/>
+              </w:rPr>
+              <w:t>đã đăng nhập</w:t>
+            </w:r>
+          </w:p>
+        </w:tc>
+        <w:tc>
+          <w:tcPr>
+            <w:tcW w:type="dxa" w:w="3888"/>
+          </w:tcPr>
+          <w:p>
+            <w:r/>
+            <w:r>
+              <w:rPr>
+                <w:sz w:val="20"/>
+              </w:rPr>
+              <w:t>Gửi đơn giải trình</w:t>
+            </w:r>
+          </w:p>
+        </w:tc>
+      </w:tr>
+      <w:tr>
+        <w:tc>
+          <w:tcPr>
+            <w:tcW w:type="dxa" w:w="1224"/>
+          </w:tcPr>
+          <w:p>
+            <w:r/>
+            <w:r>
+              <w:rPr>
+                <w:sz w:val="20"/>
+              </w:rPr>
+              <w:t>GET</w:t>
+            </w:r>
+          </w:p>
+        </w:tc>
+        <w:tc>
+          <w:tcPr>
+            <w:tcW w:type="dxa" w:w="2304"/>
+          </w:tcPr>
+          <w:p>
+            <w:r/>
+            <w:r>
+              <w:rPr>
+                <w:sz w:val="20"/>
+              </w:rPr>
+              <w:t>/api/giai-trinh</w:t>
+            </w:r>
+          </w:p>
+        </w:tc>
+        <w:tc>
+          <w:tcPr>
+            <w:tcW w:type="dxa" w:w="1368"/>
+          </w:tcPr>
+          <w:p>
+            <w:r/>
+            <w:r>
+              <w:rPr>
+                <w:sz w:val="20"/>
+              </w:rPr>
+              <w:t>quản lý</w:t>
+            </w:r>
+          </w:p>
+        </w:tc>
+        <w:tc>
+          <w:tcPr>
+            <w:tcW w:type="dxa" w:w="3888"/>
+          </w:tcPr>
+          <w:p>
+            <w:r/>
+            <w:r>
+              <w:rPr>
+                <w:sz w:val="20"/>
+              </w:rPr>
+              <w:t>Danh sách đơn</w:t>
+            </w:r>
+          </w:p>
+        </w:tc>
+      </w:tr>
+      <w:tr>
+        <w:tc>
+          <w:tcPr>
+            <w:tcW w:type="dxa" w:w="1224"/>
+          </w:tcPr>
+          <w:p>
+            <w:r/>
+            <w:r>
+              <w:rPr>
+                <w:sz w:val="20"/>
+              </w:rPr>
+              <w:t>PUT</w:t>
+            </w:r>
+          </w:p>
+        </w:tc>
+        <w:tc>
+          <w:tcPr>
+            <w:tcW w:type="dxa" w:w="2304"/>
+          </w:tcPr>
+          <w:p>
+            <w:r/>
+            <w:r>
+              <w:rPr>
+                <w:sz w:val="20"/>
+              </w:rPr>
+              <w:t>/api/giai-trinh/:id</w:t>
+            </w:r>
+          </w:p>
+        </w:tc>
+        <w:tc>
+          <w:tcPr>
+            <w:tcW w:type="dxa" w:w="1368"/>
+          </w:tcPr>
+          <w:p>
+            <w:r/>
+            <w:r>
+              <w:rPr>
+                <w:sz w:val="20"/>
+              </w:rPr>
+              <w:t>quản lý</w:t>
+            </w:r>
+          </w:p>
+        </w:tc>
+        <w:tc>
+          <w:tcPr>
+            <w:tcW w:type="dxa" w:w="3888"/>
+          </w:tcPr>
+          <w:p>
+            <w:r/>
+            <w:r>
+              <w:rPr>
+                <w:sz w:val="20"/>
+              </w:rPr>
+              <w:t>Duyệt hoặc từ chối đơn</w:t>
+            </w:r>
+          </w:p>
+        </w:tc>
+      </w:tr>
+      <w:tr>
+        <w:tc>
+          <w:tcPr>
+            <w:tcW w:type="dxa" w:w="1224"/>
+          </w:tcPr>
+          <w:p>
+            <w:r/>
+            <w:r>
+              <w:rPr>
+                <w:sz w:val="20"/>
+              </w:rPr>
+              <w:t>GET</w:t>
+            </w:r>
+          </w:p>
+        </w:tc>
+        <w:tc>
+          <w:tcPr>
+            <w:tcW w:type="dxa" w:w="2304"/>
+          </w:tcPr>
+          <w:p>
+            <w:r/>
+            <w:r>
+              <w:rPr>
+                <w:sz w:val="20"/>
+              </w:rPr>
+              <w:t>/api/canh-bao</w:t>
+            </w:r>
+          </w:p>
+        </w:tc>
+        <w:tc>
+          <w:tcPr>
+            <w:tcW w:type="dxa" w:w="1368"/>
+          </w:tcPr>
+          <w:p>
+            <w:r/>
+            <w:r>
+              <w:rPr>
+                <w:sz w:val="20"/>
+              </w:rPr>
+              <w:t>quản lý</w:t>
+            </w:r>
+          </w:p>
+        </w:tc>
+        <w:tc>
+          <w:tcPr>
+            <w:tcW w:type="dxa" w:w="3888"/>
+          </w:tcPr>
+          <w:p>
+            <w:r/>
+            <w:r>
+              <w:rPr>
+                <w:sz w:val="20"/>
+              </w:rPr>
+              <w:t>Danh sách cảnh báo bất thường</w:t>
+            </w:r>
+          </w:p>
+        </w:tc>
+      </w:tr>
+      <w:tr>
+        <w:tc>
+          <w:tcPr>
+            <w:tcW w:type="dxa" w:w="1224"/>
+          </w:tcPr>
+          <w:p>
+            <w:r/>
+            <w:r>
+              <w:rPr>
+                <w:sz w:val="20"/>
+              </w:rPr>
+              <w:t>GET</w:t>
+            </w:r>
+          </w:p>
+        </w:tc>
+        <w:tc>
+          <w:tcPr>
+            <w:tcW w:type="dxa" w:w="2304"/>
+          </w:tcPr>
+          <w:p>
+            <w:r/>
+            <w:r>
+              <w:rPr>
+                <w:sz w:val="20"/>
+              </w:rPr>
+              <w:t>/api/dashboard</w:t>
+            </w:r>
+          </w:p>
+        </w:tc>
+        <w:tc>
+          <w:tcPr>
+            <w:tcW w:type="dxa" w:w="1368"/>
+          </w:tcPr>
+          <w:p>
+            <w:r/>
+            <w:r>
+              <w:rPr>
+                <w:sz w:val="20"/>
+              </w:rPr>
+              <w:t>quản lý</w:t>
+            </w:r>
+          </w:p>
+        </w:tc>
+        <w:tc>
+          <w:tcPr>
+            <w:tcW w:type="dxa" w:w="3888"/>
+          </w:tcPr>
+          <w:p>
+            <w:r/>
+            <w:r>
+              <w:rPr>
+                <w:sz w:val="20"/>
+              </w:rPr>
+              <w:t>Số liệu tổng hợp</w:t>
+            </w:r>
+          </w:p>
+        </w:tc>
+      </w:tr>
+      <w:tr>
+        <w:tc>
+          <w:tcPr>
+            <w:tcW w:type="dxa" w:w="1224"/>
+          </w:tcPr>
+          <w:p>
+            <w:r/>
+            <w:r>
+              <w:rPr>
+                <w:sz w:val="20"/>
+              </w:rPr>
+              <w:t>GET</w:t>
+            </w:r>
+          </w:p>
+        </w:tc>
+        <w:tc>
+          <w:tcPr>
+            <w:tcW w:type="dxa" w:w="2304"/>
+          </w:tcPr>
+          <w:p>
+            <w:r/>
+            <w:r>
+              <w:rPr>
+                <w:sz w:val="20"/>
+              </w:rPr>
+              <w:t>/api/bao-cao/cong</w:t>
+            </w:r>
+          </w:p>
+        </w:tc>
+        <w:tc>
+          <w:tcPr>
+            <w:tcW w:type="dxa" w:w="1368"/>
+          </w:tcPr>
+          <w:p>
+            <w:r/>
+            <w:r>
+              <w:rPr>
+                <w:sz w:val="20"/>
+              </w:rPr>
+              <w:t>quản lý</w:t>
+            </w:r>
+          </w:p>
+        </w:tc>
+        <w:tc>
+          <w:tcPr>
+            <w:tcW w:type="dxa" w:w="3888"/>
+          </w:tcPr>
+          <w:p>
+            <w:r/>
+            <w:r>
+              <w:rPr>
+                <w:sz w:val="20"/>
+              </w:rPr>
+              <w:t>Báo cáo công theo tháng</w:t>
+            </w:r>
+          </w:p>
+        </w:tc>
+      </w:tr>
+    </w:tbl>
+    <w:p>
+      <w:r>
+        <w:rPr>
+          <w:b w:val="0"/>
+          <w:i w:val="0"/>
+        </w:rPr>
+      </w:r>
+    </w:p>
+    <w:p>
+      <w:pPr>
+        <w:jc w:val="center"/>
+      </w:pPr>
+      <w:r>
+        <w:drawing>
+          <wp:inline>
+            <wp:extent cx="5577840" cy="3007183"/>
+            <wp:docPr id="12" name="Picture 12"/>
+            <wp:cNvGraphicFramePr>
+              <a:graphicFrameLocks noChangeAspect="1"/>
+            </wp:cNvGraphicFramePr>
+            <a:graphic>
+              <a:graphicData uri="http://schemas.openxmlformats.org/drawingml/2006/picture">
+                <pic:pic>
+                  <pic:nvPicPr>
+                    <pic:cNvPr id="0" name="03-app-cham-cong.png"/>
+                    <pic:cNvPicPr/>
+                  </pic:nvPicPr>
+                  <pic:blipFill>
+                    <a:blip r:embed="rId21"/>
+                    <a:stretch>
+                      <a:fillRect/>
+                    </a:stretch>
+                  </pic:blipFill>
+                  <pic:spPr>
+                    <a:xfrm>
+                      <a:off x="0" y="0"/>
+                      <a:ext cx="5577840" cy="3007183"/>
+                    </a:xfrm>
+                    <a:prstGeom prst="rect"/>
+                  </pic:spPr>
+                </pic:pic>
+              </a:graphicData>
+            </a:graphic>
+          </wp:inline>
+        </w:drawing>
+      </w:r>
+    </w:p>
+    <w:p>
+      <w:pPr>
+        <w:jc w:val="center"/>
+      </w:pPr>
+      <w:r>
+        <w:rPr>
+          <w:i/>
+          <w:sz w:val="19"/>
+        </w:rPr>
+        <w:t>Hình 3.2 — Màn hình chấm công đã cài đặt: thông tin làm việc lấy từ cơ sở dữ liệu, thanh chọn tầng, bản đồ ba chiều hiển thị các khối MAP</w:t>
+      </w:r>
+    </w:p>
+    <w:p>
+      <w:r>
+        <w:rPr>
+          <w:b w:val="0"/>
+          <w:i w:val="0"/>
+        </w:rPr>
+      </w:r>
+    </w:p>
+    <w:p>
+      <w:pPr>
+        <w:jc w:val="center"/>
+      </w:pPr>
+      <w:r>
+        <w:drawing>
+          <wp:inline>
+            <wp:extent cx="5577840" cy="3007183"/>
+            <wp:docPr id="13" name="Picture 13"/>
+            <wp:cNvGraphicFramePr>
+              <a:graphicFrameLocks noChangeAspect="1"/>
+            </wp:cNvGraphicFramePr>
+            <a:graphic>
+              <a:graphicData uri="http://schemas.openxmlformats.org/drawingml/2006/picture">
+                <pic:pic>
+                  <pic:nvPicPr>
+                    <pic:cNvPr id="0" name="04-app-quan-ly.png"/>
+                    <pic:cNvPicPr/>
+                  </pic:nvPicPr>
+                  <pic:blipFill>
+                    <a:blip r:embed="rId22"/>
+                    <a:stretch>
+                      <a:fillRect/>
+                    </a:stretch>
+                  </pic:blipFill>
+                  <pic:spPr>
+                    <a:xfrm>
+                      <a:off x="0" y="0"/>
+                      <a:ext cx="5577840" cy="3007183"/>
+                    </a:xfrm>
+                    <a:prstGeom prst="rect"/>
+                  </pic:spPr>
+                </pic:pic>
+              </a:graphicData>
+            </a:graphic>
+          </wp:inline>
+        </w:drawing>
+      </w:r>
+    </w:p>
+    <w:p>
+      <w:pPr>
+        <w:jc w:val="center"/>
+      </w:pPr>
+      <w:r>
+        <w:rPr>
+          <w:i/>
+          <w:sz w:val="19"/>
+        </w:rPr>
+        <w:t>Hình 3.3 — Bảng điều khiển của quản lý: số liệu tổng hợp và danh sách cảnh báo bất thường sinh ra từ bốn quy tắc R1–R4</w:t>
+      </w:r>
+    </w:p>
+    <w:p>
+      <w:r>
+        <w:rPr>
+          <w:b w:val="0"/>
+          <w:i w:val="0"/>
+        </w:rPr>
+      </w:r>
+    </w:p>
+    <w:p>
       <w:pPr>
         <w:pageBreakBefore w:val="0"/>
         <w:rPr>
@@ -8859,7 +9588,7 @@
         <w:drawing>
           <wp:inline>
             <wp:extent cx="5577840" cy="3004281"/>
-            <wp:docPr id="12" name="Picture 12"/>
+            <wp:docPr id="14" name="Picture 14"/>
             <wp:cNvGraphicFramePr>
               <a:graphicFrameLocks noChangeAspect="1"/>
             </wp:cNvGraphicFramePr>
@@ -8871,7 +9600,7 @@
                     <pic:cNvPicPr/>
                   </pic:nvPicPr>
                   <pic:blipFill>
-                    <a:blip r:embed="rId21"/>
+                    <a:blip r:embed="rId23"/>
                     <a:stretch>
                       <a:fillRect/>
                     </a:stretch>
@@ -8902,6 +9631,293 @@
         <w:t>Hình 4.1 — Màn hình kết quả tình huống sai tầng; điểm chấm công (hình cầu) nằm trong khối của doanh nghiệp khác</w:t>
       </w:r>
     </w:p>
+    <w:p>
+      <w:r>
+        <w:rPr>
+          <w:b w:val="0"/>
+          <w:i w:val="0"/>
+        </w:rPr>
+      </w:r>
+    </w:p>
+    <w:p>
+      <w:r>
+        <w:rPr>
+          <w:b w:val="0"/>
+          <w:i w:val="0"/>
+        </w:rPr>
+      </w:r>
+    </w:p>
+    <w:p>
+      <w:r>
+        <w:rPr>
+          <w:b/>
+          <w:i w:val="0"/>
+        </w:rPr>
+        <w:t>Kiểm chứng cơ sở dữ liệu và toàn hệ thống</w:t>
+      </w:r>
+    </w:p>
+    <w:p>
+      <w:r>
+        <w:rPr>
+          <w:b w:val="0"/>
+          <w:i w:val="0"/>
+        </w:rPr>
+        <w:t>Lược đồ và các hàm nghiệp vụ đã được chạy thật trên PostgreSQL 17.6 kết hợp PostGIS 3.6.2: tạo 15 bảng, 4 hàm và 1 trigger; trigger suy cao độ cho ra đúng các dải 23,60–42,20 m, 93,35–116,60 m và 163,10–191,00 m như công thức đã nêu. Sau đó các luồng nghiệp vụ được chạy thử đầu cuối qua API thật trên chính cơ sở dữ liệu đó.</w:t>
+      </w:r>
+    </w:p>
+    <w:tbl>
+      <w:tblPr>
+        <w:tblStyle w:val="TableGrid"/>
+        <w:tblW w:type="auto" w:w="0"/>
+        <w:tblLook w:firstColumn="1" w:firstRow="1" w:lastColumn="0" w:lastRow="0" w:noHBand="0" w:noVBand="1" w:val="04A0"/>
+      </w:tblPr>
+      <w:tblGrid>
+        <w:gridCol w:w="4680"/>
+        <w:gridCol w:w="4680"/>
+      </w:tblGrid>
+      <w:tr>
+        <w:tc>
+          <w:tcPr>
+            <w:tcW w:type="dxa" w:w="3744"/>
+          </w:tcPr>
+          <w:p>
+            <w:r/>
+            <w:r>
+              <w:rPr>
+                <w:b/>
+                <w:sz w:val="20"/>
+              </w:rPr>
+              <w:t>Kịch bản kiểm thử</w:t>
+            </w:r>
+          </w:p>
+        </w:tc>
+        <w:tc>
+          <w:tcPr>
+            <w:tcW w:type="dxa" w:w="5040"/>
+          </w:tcPr>
+          <w:p>
+            <w:r/>
+            <w:r>
+              <w:rPr>
+                <w:b/>
+                <w:sz w:val="20"/>
+              </w:rPr>
+              <w:t>Kết quả hệ thống trả về</w:t>
+            </w:r>
+          </w:p>
+        </w:tc>
+      </w:tr>
+      <w:tr>
+        <w:tc>
+          <w:tcPr>
+            <w:tcW w:type="dxa" w:w="3744"/>
+          </w:tcPr>
+          <w:p>
+            <w:r/>
+            <w:r>
+              <w:rPr>
+                <w:sz w:val="20"/>
+              </w:rPr>
+              <w:t>Chấm công đúng tầng 6</w:t>
+            </w:r>
+          </w:p>
+        </w:tc>
+        <w:tc>
+          <w:tcPr>
+            <w:tcW w:type="dxa" w:w="5040"/>
+          </w:tcPr>
+          <w:p>
+            <w:r/>
+            <w:r>
+              <w:rPr>
+                <w:sz w:val="20"/>
+              </w:rPr>
+              <w:t>HOP_LE</w:t>
+            </w:r>
+          </w:p>
+        </w:tc>
+      </w:tr>
+      <w:tr>
+        <w:tc>
+          <w:tcPr>
+            <w:tcW w:type="dxa" w:w="3744"/>
+          </w:tcPr>
+          <w:p>
+            <w:r/>
+            <w:r>
+              <w:rPr>
+                <w:sz w:val="20"/>
+              </w:rPr>
+              <w:t>Khai báo tầng 22 trong khi thuê tầng 5–8</w:t>
+            </w:r>
+          </w:p>
+        </w:tc>
+        <w:tc>
+          <w:tcPr>
+            <w:tcW w:type="dxa" w:w="5040"/>
+          </w:tcPr>
+          <w:p>
+            <w:r/>
+            <w:r>
+              <w:rPr>
+                <w:sz w:val="20"/>
+              </w:rPr>
+              <w:t>NGHI_NGO, kèm cảnh báo R1: lệch 62,78 m tương đương 13,5 tầng</w:t>
+            </w:r>
+          </w:p>
+        </w:tc>
+      </w:tr>
+      <w:tr>
+        <w:tc>
+          <w:tcPr>
+            <w:tcW w:type="dxa" w:w="3744"/>
+          </w:tcPr>
+          <w:p>
+            <w:r/>
+            <w:r>
+              <w:rPr>
+                <w:sz w:val="20"/>
+              </w:rPr>
+              <w:t>Chấm công ở vị trí cách toà nhà 270 m</w:t>
+            </w:r>
+          </w:p>
+        </w:tc>
+        <w:tc>
+          <w:tcPr>
+            <w:tcW w:type="dxa" w:w="5040"/>
+          </w:tcPr>
+          <w:p>
+            <w:r/>
+            <w:r>
+              <w:rPr>
+                <w:sz w:val="20"/>
+              </w:rPr>
+              <w:t>NGOAI_VUNG, kèm cảnh báo R2 về dịch chuyển bất khả thi</w:t>
+            </w:r>
+          </w:p>
+        </w:tc>
+      </w:tr>
+      <w:tr>
+        <w:tc>
+          <w:tcPr>
+            <w:tcW w:type="dxa" w:w="3744"/>
+          </w:tcPr>
+          <w:p>
+            <w:r/>
+            <w:r>
+              <w:rPr>
+                <w:sz w:val="20"/>
+              </w:rPr>
+              <w:t>Thiết bị báo độ chính xác 0,3 m</w:t>
+            </w:r>
+          </w:p>
+        </w:tc>
+        <w:tc>
+          <w:tcPr>
+            <w:tcW w:type="dxa" w:w="5040"/>
+          </w:tcPr>
+          <w:p>
+            <w:r/>
+            <w:r>
+              <w:rPr>
+                <w:sz w:val="20"/>
+              </w:rPr>
+              <w:t>Cảnh báo R3: độ chính xác nhỏ bất thường, nghi giả lập vị trí</w:t>
+            </w:r>
+          </w:p>
+        </w:tc>
+      </w:tr>
+      <w:tr>
+        <w:tc>
+          <w:tcPr>
+            <w:tcW w:type="dxa" w:w="3744"/>
+          </w:tcPr>
+          <w:p>
+            <w:r/>
+            <w:r>
+              <w:rPr>
+                <w:sz w:val="20"/>
+              </w:rPr>
+              <w:t>Nhân viên khác dùng lại cùng một thiết bị</w:t>
+            </w:r>
+          </w:p>
+        </w:tc>
+        <w:tc>
+          <w:tcPr>
+            <w:tcW w:type="dxa" w:w="5040"/>
+          </w:tcPr>
+          <w:p>
+            <w:r/>
+            <w:r>
+              <w:rPr>
+                <w:sz w:val="20"/>
+              </w:rPr>
+              <w:t>Cảnh báo R4: thiết bị vừa được nhân viên khác dùng để chấm công</w:t>
+            </w:r>
+          </w:p>
+        </w:tc>
+      </w:tr>
+      <w:tr>
+        <w:tc>
+          <w:tcPr>
+            <w:tcW w:type="dxa" w:w="3744"/>
+          </w:tcPr>
+          <w:p>
+            <w:r/>
+            <w:r>
+              <w:rPr>
+                <w:sz w:val="20"/>
+              </w:rPr>
+              <w:t>Nhân viên gọi API dành cho quản lý</w:t>
+            </w:r>
+          </w:p>
+        </w:tc>
+        <w:tc>
+          <w:tcPr>
+            <w:tcW w:type="dxa" w:w="5040"/>
+          </w:tcPr>
+          <w:p>
+            <w:r/>
+            <w:r>
+              <w:rPr>
+                <w:sz w:val="20"/>
+              </w:rPr>
+              <w:t>HTTP 403 — không đủ quyền thực hiện chức năng này</w:t>
+            </w:r>
+          </w:p>
+        </w:tc>
+      </w:tr>
+      <w:tr>
+        <w:tc>
+          <w:tcPr>
+            <w:tcW w:type="dxa" w:w="3744"/>
+          </w:tcPr>
+          <w:p>
+            <w:r/>
+            <w:r>
+              <w:rPr>
+                <w:sz w:val="20"/>
+              </w:rPr>
+              <w:t>Quản lý duyệt đơn giải trình</w:t>
+            </w:r>
+          </w:p>
+        </w:tc>
+        <w:tc>
+          <w:tcPr>
+            <w:tcW w:type="dxa" w:w="5040"/>
+          </w:tcPr>
+          <w:p>
+            <w:r/>
+            <w:r>
+              <w:rPr>
+                <w:sz w:val="20"/>
+              </w:rPr>
+              <w:t>Bản ghi chuyển từ NGOAI_VUNG sang HOP_LE, cảnh báo liên quan được đóng, báo cáo công cập nhật theo</w:t>
+            </w:r>
+          </w:p>
+        </w:tc>
+      </w:tr>
+    </w:tbl>
     <w:p>
       <w:r>
         <w:rPr>

</xml_diff>